<commit_message>
docs: reference the mission-prompts provenance file from START_HERE
</commit_message>
<xml_diff>
--- a/documentation/START_HERE.docx
+++ b/documentation/START_HERE.docx
@@ -866,6 +866,51 @@
                 <w:highlight w:val="lightGray"/>
               </w:rPr>
               <w:t xml:space="preserve">11_LICENSE_AND_NOTICES/</w:t>
+            </w:r>
+          </w:p>
+        </w:tc>
+      </w:tr>
+      <w:tr>
+        <w:trPr>
+          <w:cantSplit/>
+        </w:trPr>
+        <w:tc>
+          <w:tcPr>
+            <w:tcBorders>
+              <w:top w:val="single" w:sz="1" w:space="0" w:color="000000"/>
+              <w:bottom w:val="single" w:sz="1" w:space="0" w:color="000000"/>
+              <w:left w:val="single" w:sz="1" w:space="0" w:color="000000"/>
+              <w:right w:val="single" w:sz="1" w:space="0" w:color="000000"/>
+            </w:tcBorders>
+          </w:tcPr>
+          <w:p>
+            <w:pPr>
+              <w:spacing w:lineRule="auto"/>
+            </w:pPr>
+            <w:r>
+              <w:rPr/>
+              <w:t xml:space="preserve">The exact prompts used to build this submission</w:t>
+            </w:r>
+          </w:p>
+        </w:tc>
+        <w:tc>
+          <w:tcPr>
+            <w:tcBorders>
+              <w:top w:val="single" w:sz="1" w:space="0" w:color="000000"/>
+              <w:bottom w:val="single" w:sz="1" w:space="0" w:color="000000"/>
+              <w:left w:val="single" w:sz="1" w:space="0" w:color="000000"/>
+              <w:right w:val="single" w:sz="1" w:space="0" w:color="000000"/>
+            </w:tcBorders>
+          </w:tcPr>
+          <w:p>
+            <w:pPr>
+              <w:spacing w:lineRule="auto"/>
+            </w:pPr>
+            <w:r>
+              <w:rPr>
+                <w:highlight w:val="lightGray"/>
+              </w:rPr>
+              <w:t xml:space="preserve">00_START_HERE/MISSION_PROMPTS_USED.md</w:t>
             </w:r>
           </w:p>
         </w:tc>

</xml_diff>